<commit_message>
fixed the plotting script
</commit_message>
<xml_diff>
--- a/docs/content/multivariate_statistics/multivariate_statistics_lecture.docx
+++ b/docs/content/multivariate_statistics/multivariate_statistics_lecture.docx
@@ -19283,6 +19283,150 @@
         <w:rPr>
           <w:rStyle w:val="DocumentationTok"/>
         </w:rPr>
+        <w:t xml:space="preserve">##          Df SumOfSqs      R2      F Pr(&gt;F)   </w:t>
+      </w:r>
+      <w:r>
+        <w:br/>
+      </w:r>
+      <w:r>
+        <w:rPr>
+          <w:rStyle w:val="DocumentationTok"/>
+        </w:rPr>
+        <w:t xml:space="preserve">## Model     1   32.602 0.10636 5.7128  0.003 **</w:t>
+      </w:r>
+      <w:r>
+        <w:br/>
+      </w:r>
+      <w:r>
+        <w:rPr>
+          <w:rStyle w:val="DocumentationTok"/>
+        </w:rPr>
+        <w:t xml:space="preserve">## Residual 48  273.930 0.89364                 </w:t>
+      </w:r>
+      <w:r>
+        <w:br/>
+      </w:r>
+      <w:r>
+        <w:rPr>
+          <w:rStyle w:val="DocumentationTok"/>
+        </w:rPr>
+        <w:t xml:space="preserve">## Total    49  306.532 1.00000                 </w:t>
+      </w:r>
+      <w:r>
+        <w:br/>
+      </w:r>
+      <w:r>
+        <w:rPr>
+          <w:rStyle w:val="DocumentationTok"/>
+        </w:rPr>
+        <w:t xml:space="preserve">## ---</w:t>
+      </w:r>
+      <w:r>
+        <w:br/>
+      </w:r>
+      <w:r>
+        <w:rPr>
+          <w:rStyle w:val="DocumentationTok"/>
+        </w:rPr>
+        <w:t xml:space="preserve">## Signif. codes:  0 '***' 0.001 '**' 0.01 '*' 0.05 '.' 0.1 ' ' 1</w:t>
+      </w:r>
+      <w:r>
+        <w:br/>
+      </w:r>
+      <w:r>
+        <w:rPr>
+          <w:rStyle w:val="DocumentationTok"/>
+        </w:rPr>
+        <w:t xml:space="preserve">## </w:t>
+      </w:r>
+      <w:r>
+        <w:br/>
+      </w:r>
+      <w:r>
+        <w:rPr>
+          <w:rStyle w:val="DocumentationTok"/>
+        </w:rPr>
+        <w:t xml:space="preserve">## $TJH_vs_LEH</w:t>
+      </w:r>
+      <w:r>
+        <w:br/>
+      </w:r>
+      <w:r>
+        <w:rPr>
+          <w:rStyle w:val="DocumentationTok"/>
+        </w:rPr>
+        <w:t xml:space="preserve">##          Df SumOfSqs      R2      F Pr(&gt;F)   </w:t>
+      </w:r>
+      <w:r>
+        <w:br/>
+      </w:r>
+      <w:r>
+        <w:rPr>
+          <w:rStyle w:val="DocumentationTok"/>
+        </w:rPr>
+        <w:t xml:space="preserve">## Model     1    47.72 0.10517 5.6414  0.006 **</w:t>
+      </w:r>
+      <w:r>
+        <w:br/>
+      </w:r>
+      <w:r>
+        <w:rPr>
+          <w:rStyle w:val="DocumentationTok"/>
+        </w:rPr>
+        <w:t xml:space="preserve">## Residual 48   406.06 0.89483                 </w:t>
+      </w:r>
+      <w:r>
+        <w:br/>
+      </w:r>
+      <w:r>
+        <w:rPr>
+          <w:rStyle w:val="DocumentationTok"/>
+        </w:rPr>
+        <w:t xml:space="preserve">## Total    49   453.78 1.00000                 </w:t>
+      </w:r>
+      <w:r>
+        <w:br/>
+      </w:r>
+      <w:r>
+        <w:rPr>
+          <w:rStyle w:val="DocumentationTok"/>
+        </w:rPr>
+        <w:t xml:space="preserve">## ---</w:t>
+      </w:r>
+      <w:r>
+        <w:br/>
+      </w:r>
+      <w:r>
+        <w:rPr>
+          <w:rStyle w:val="DocumentationTok"/>
+        </w:rPr>
+        <w:t xml:space="preserve">## Signif. codes:  0 '***' 0.001 '**' 0.01 '*' 0.05 '.' 0.1 ' ' 1</w:t>
+      </w:r>
+      <w:r>
+        <w:br/>
+      </w:r>
+      <w:r>
+        <w:rPr>
+          <w:rStyle w:val="DocumentationTok"/>
+        </w:rPr>
+        <w:t xml:space="preserve">## </w:t>
+      </w:r>
+      <w:r>
+        <w:br/>
+      </w:r>
+      <w:r>
+        <w:rPr>
+          <w:rStyle w:val="DocumentationTok"/>
+        </w:rPr>
+        <w:t xml:space="preserve">## $TJH_vs_HD</w:t>
+      </w:r>
+      <w:r>
+        <w:br/>
+      </w:r>
+      <w:r>
+        <w:rPr>
+          <w:rStyle w:val="DocumentationTok"/>
+        </w:rPr>
         <w:t xml:space="preserve">##          Df SumOfSqs      R2      F Pr(&gt;F)    </w:t>
       </w:r>
       <w:r>
@@ -19292,7 +19436,7 @@
         <w:rPr>
           <w:rStyle w:val="DocumentationTok"/>
         </w:rPr>
-        <w:t xml:space="preserve">## Model     1   32.602 0.10636 5.7128  0.001 ***</w:t>
+        <w:t xml:space="preserve">## Model     1   69.308 0.25135 11.751  0.001 ***</w:t>
       </w:r>
       <w:r>
         <w:br/>
@@ -19301,7 +19445,7 @@
         <w:rPr>
           <w:rStyle w:val="DocumentationTok"/>
         </w:rPr>
-        <w:t xml:space="preserve">## Residual 48  273.930 0.89364                  </w:t>
+        <w:t xml:space="preserve">## Residual 35  206.432 0.74865                  </w:t>
       </w:r>
       <w:r>
         <w:br/>
@@ -19310,7 +19454,7 @@
         <w:rPr>
           <w:rStyle w:val="DocumentationTok"/>
         </w:rPr>
-        <w:t xml:space="preserve">## Total    49  306.532 1.00000                  </w:t>
+        <w:t xml:space="preserve">## Total    36  275.740 1.00000                  </w:t>
       </w:r>
       <w:r>
         <w:br/>
@@ -19346,7 +19490,7 @@
         <w:rPr>
           <w:rStyle w:val="DocumentationTok"/>
         </w:rPr>
-        <w:t xml:space="preserve">## $TJH_vs_LEH</w:t>
+        <w:t xml:space="preserve">## $DG_vs_LEH</w:t>
       </w:r>
       <w:r>
         <w:br/>
@@ -19355,7 +19499,7 @@
         <w:rPr>
           <w:rStyle w:val="DocumentationTok"/>
         </w:rPr>
-        <w:t xml:space="preserve">##          Df SumOfSqs      R2      F Pr(&gt;F)   </w:t>
+        <w:t xml:space="preserve">##          Df SumOfSqs      R2      F Pr(&gt;F)  </w:t>
       </w:r>
       <w:r>
         <w:br/>
@@ -19364,151 +19508,7 @@
         <w:rPr>
           <w:rStyle w:val="DocumentationTok"/>
         </w:rPr>
-        <w:t xml:space="preserve">## Model     1    47.72 0.10517 5.6414  0.003 **</w:t>
-      </w:r>
-      <w:r>
-        <w:br/>
-      </w:r>
-      <w:r>
-        <w:rPr>
-          <w:rStyle w:val="DocumentationTok"/>
-        </w:rPr>
-        <w:t xml:space="preserve">## Residual 48   406.06 0.89483                 </w:t>
-      </w:r>
-      <w:r>
-        <w:br/>
-      </w:r>
-      <w:r>
-        <w:rPr>
-          <w:rStyle w:val="DocumentationTok"/>
-        </w:rPr>
-        <w:t xml:space="preserve">## Total    49   453.78 1.00000                 </w:t>
-      </w:r>
-      <w:r>
-        <w:br/>
-      </w:r>
-      <w:r>
-        <w:rPr>
-          <w:rStyle w:val="DocumentationTok"/>
-        </w:rPr>
-        <w:t xml:space="preserve">## ---</w:t>
-      </w:r>
-      <w:r>
-        <w:br/>
-      </w:r>
-      <w:r>
-        <w:rPr>
-          <w:rStyle w:val="DocumentationTok"/>
-        </w:rPr>
-        <w:t xml:space="preserve">## Signif. codes:  0 '***' 0.001 '**' 0.01 '*' 0.05 '.' 0.1 ' ' 1</w:t>
-      </w:r>
-      <w:r>
-        <w:br/>
-      </w:r>
-      <w:r>
-        <w:rPr>
-          <w:rStyle w:val="DocumentationTok"/>
-        </w:rPr>
-        <w:t xml:space="preserve">## </w:t>
-      </w:r>
-      <w:r>
-        <w:br/>
-      </w:r>
-      <w:r>
-        <w:rPr>
-          <w:rStyle w:val="DocumentationTok"/>
-        </w:rPr>
-        <w:t xml:space="preserve">## $TJH_vs_HD</w:t>
-      </w:r>
-      <w:r>
-        <w:br/>
-      </w:r>
-      <w:r>
-        <w:rPr>
-          <w:rStyle w:val="DocumentationTok"/>
-        </w:rPr>
-        <w:t xml:space="preserve">##          Df SumOfSqs      R2      F Pr(&gt;F)    </w:t>
-      </w:r>
-      <w:r>
-        <w:br/>
-      </w:r>
-      <w:r>
-        <w:rPr>
-          <w:rStyle w:val="DocumentationTok"/>
-        </w:rPr>
-        <w:t xml:space="preserve">## Model     1   69.308 0.25135 11.751  0.001 ***</w:t>
-      </w:r>
-      <w:r>
-        <w:br/>
-      </w:r>
-      <w:r>
-        <w:rPr>
-          <w:rStyle w:val="DocumentationTok"/>
-        </w:rPr>
-        <w:t xml:space="preserve">## Residual 35  206.432 0.74865                  </w:t>
-      </w:r>
-      <w:r>
-        <w:br/>
-      </w:r>
-      <w:r>
-        <w:rPr>
-          <w:rStyle w:val="DocumentationTok"/>
-        </w:rPr>
-        <w:t xml:space="preserve">## Total    36  275.740 1.00000                  </w:t>
-      </w:r>
-      <w:r>
-        <w:br/>
-      </w:r>
-      <w:r>
-        <w:rPr>
-          <w:rStyle w:val="DocumentationTok"/>
-        </w:rPr>
-        <w:t xml:space="preserve">## ---</w:t>
-      </w:r>
-      <w:r>
-        <w:br/>
-      </w:r>
-      <w:r>
-        <w:rPr>
-          <w:rStyle w:val="DocumentationTok"/>
-        </w:rPr>
-        <w:t xml:space="preserve">## Signif. codes:  0 '***' 0.001 '**' 0.01 '*' 0.05 '.' 0.1 ' ' 1</w:t>
-      </w:r>
-      <w:r>
-        <w:br/>
-      </w:r>
-      <w:r>
-        <w:rPr>
-          <w:rStyle w:val="DocumentationTok"/>
-        </w:rPr>
-        <w:t xml:space="preserve">## </w:t>
-      </w:r>
-      <w:r>
-        <w:br/>
-      </w:r>
-      <w:r>
-        <w:rPr>
-          <w:rStyle w:val="DocumentationTok"/>
-        </w:rPr>
-        <w:t xml:space="preserve">## $DG_vs_LEH</w:t>
-      </w:r>
-      <w:r>
-        <w:br/>
-      </w:r>
-      <w:r>
-        <w:rPr>
-          <w:rStyle w:val="DocumentationTok"/>
-        </w:rPr>
-        <w:t xml:space="preserve">##          Df SumOfSqs      R2      F Pr(&gt;F)  </w:t>
-      </w:r>
-      <w:r>
-        <w:br/>
-      </w:r>
-      <w:r>
-        <w:rPr>
-          <w:rStyle w:val="DocumentationTok"/>
-        </w:rPr>
-        <w:t xml:space="preserve">## Model     1    26.24 0.06493 3.3333  0.018 *</w:t>
+        <w:t xml:space="preserve">## Model     1    26.24 0.06493 3.3333  0.011 *</w:t>
       </w:r>
       <w:r>
         <w:br/>
@@ -20015,7 +20015,7 @@
         <w:rPr>
           <w:rStyle w:val="DocumentationTok"/>
         </w:rPr>
-        <w:t xml:space="preserve">## LEH 0.132 0.006 -    </w:t>
+        <w:t xml:space="preserve">## LEH 0.090 0.006 -    </w:t>
       </w:r>
       <w:r>
         <w:br/>
@@ -20024,7 +20024,7 @@
         <w:rPr>
           <w:rStyle w:val="DocumentationTok"/>
         </w:rPr>
-        <w:t xml:space="preserve">## TJH 0.012 0.006 0.006</w:t>
+        <w:t xml:space="preserve">## TJH 0.006 0.006 0.018</w:t>
       </w:r>
       <w:r>
         <w:br/>

</xml_diff>

<commit_message>
fixed desing to be more interacive
</commit_message>
<xml_diff>
--- a/docs/content/multivariate_statistics/multivariate_statistics_lecture.docx
+++ b/docs/content/multivariate_statistics/multivariate_statistics_lecture.docx
@@ -19292,7 +19292,7 @@
         <w:rPr>
           <w:rStyle w:val="DocumentationTok"/>
         </w:rPr>
-        <w:t xml:space="preserve">## Model     1   32.602 0.10636 5.7128  0.005 **</w:t>
+        <w:t xml:space="preserve">## Model     1   32.602 0.10636 5.7128  0.002 **</w:t>
       </w:r>
       <w:r>
         <w:br/>
@@ -19364,7 +19364,7 @@
         <w:rPr>
           <w:rStyle w:val="DocumentationTok"/>
         </w:rPr>
-        <w:t xml:space="preserve">## Model     1    47.72 0.10517 5.6414  0.006 **</w:t>
+        <w:t xml:space="preserve">## Model     1    47.72 0.10517 5.6414  0.002 **</w:t>
       </w:r>
       <w:r>
         <w:br/>
@@ -19508,7 +19508,7 @@
         <w:rPr>
           <w:rStyle w:val="DocumentationTok"/>
         </w:rPr>
-        <w:t xml:space="preserve">## Model     1    26.24 0.06493 3.3333  0.017 *</w:t>
+        <w:t xml:space="preserve">## Model     1    26.24 0.06493 3.3333  0.016 *</w:t>
       </w:r>
       <w:r>
         <w:br/>
@@ -20015,7 +20015,7 @@
         <w:rPr>
           <w:rStyle w:val="DocumentationTok"/>
         </w:rPr>
-        <w:t xml:space="preserve">## LEH 0.120 0.006 -    </w:t>
+        <w:t xml:space="preserve">## LEH 0.132 0.006 -    </w:t>
       </w:r>
       <w:r>
         <w:br/>
@@ -20024,7 +20024,7 @@
         <w:rPr>
           <w:rStyle w:val="DocumentationTok"/>
         </w:rPr>
-        <w:t xml:space="preserve">## TJH 0.006 0.006 0.006</w:t>
+        <w:t xml:space="preserve">## TJH 0.018 0.006 0.024</w:t>
       </w:r>
       <w:r>
         <w:br/>

</xml_diff>

<commit_message>
fixed the sampling design lecture and its GREAT now... will not do activity
</commit_message>
<xml_diff>
--- a/docs/content/multivariate_statistics/multivariate_statistics_lecture.docx
+++ b/docs/content/multivariate_statistics/multivariate_statistics_lecture.docx
@@ -19292,7 +19292,7 @@
         <w:rPr>
           <w:rStyle w:val="DocumentationTok"/>
         </w:rPr>
-        <w:t xml:space="preserve">## Model     1   32.602 0.10636 5.7128  0.002 **</w:t>
+        <w:t xml:space="preserve">## Model     1   32.602 0.10636 5.7128  0.003 **</w:t>
       </w:r>
       <w:r>
         <w:br/>
@@ -19508,7 +19508,7 @@
         <w:rPr>
           <w:rStyle w:val="DocumentationTok"/>
         </w:rPr>
-        <w:t xml:space="preserve">## Model     1    26.24 0.06493 3.3333  0.016 *</w:t>
+        <w:t xml:space="preserve">## Model     1    26.24 0.06493 3.3333  0.018 *</w:t>
       </w:r>
       <w:r>
         <w:br/>
@@ -20015,7 +20015,7 @@
         <w:rPr>
           <w:rStyle w:val="DocumentationTok"/>
         </w:rPr>
-        <w:t xml:space="preserve">## LEH 0.132 0.006 -    </w:t>
+        <w:t xml:space="preserve">## LEH 0.138 0.006 -    </w:t>
       </w:r>
       <w:r>
         <w:br/>
@@ -20024,7 +20024,7 @@
         <w:rPr>
           <w:rStyle w:val="DocumentationTok"/>
         </w:rPr>
-        <w:t xml:space="preserve">## TJH 0.018 0.006 0.024</w:t>
+        <w:t xml:space="preserve">## TJH 0.012 0.006 0.012</w:t>
       </w:r>
       <w:r>
         <w:br/>

</xml_diff>

<commit_message>
starting to do the multiple regression
</commit_message>
<xml_diff>
--- a/docs/content/multivariate_statistics/multivariate_statistics_lecture.docx
+++ b/docs/content/multivariate_statistics/multivariate_statistics_lecture.docx
@@ -19292,7 +19292,7 @@
         <w:rPr>
           <w:rStyle w:val="DocumentationTok"/>
         </w:rPr>
-        <w:t xml:space="preserve">## Model     1   32.602 0.10636 5.7128  0.004 **</w:t>
+        <w:t xml:space="preserve">## Model     1   32.602 0.10636 5.7128  0.002 **</w:t>
       </w:r>
       <w:r>
         <w:br/>
@@ -19364,7 +19364,7 @@
         <w:rPr>
           <w:rStyle w:val="DocumentationTok"/>
         </w:rPr>
-        <w:t xml:space="preserve">## Model     1    47.72 0.10517 5.6414  0.002 **</w:t>
+        <w:t xml:space="preserve">## Model     1    47.72 0.10517 5.6414  0.003 **</w:t>
       </w:r>
       <w:r>
         <w:br/>
@@ -19508,7 +19508,7 @@
         <w:rPr>
           <w:rStyle w:val="DocumentationTok"/>
         </w:rPr>
-        <w:t xml:space="preserve">## Model     1    26.24 0.06493 3.3333  0.019 *</w:t>
+        <w:t xml:space="preserve">## Model     1    26.24 0.06493 3.3333  0.022 *</w:t>
       </w:r>
       <w:r>
         <w:br/>
@@ -20015,7 +20015,7 @@
         <w:rPr>
           <w:rStyle w:val="DocumentationTok"/>
         </w:rPr>
-        <w:t xml:space="preserve">## LEH 0.138 0.006 -    </w:t>
+        <w:t xml:space="preserve">## LEH 0.162 0.006 -    </w:t>
       </w:r>
       <w:r>
         <w:br/>
@@ -20024,7 +20024,7 @@
         <w:rPr>
           <w:rStyle w:val="DocumentationTok"/>
         </w:rPr>
-        <w:t xml:space="preserve">## TJH 0.012 0.006 0.012</w:t>
+        <w:t xml:space="preserve">## TJH 0.006 0.006 0.012</w:t>
       </w:r>
       <w:r>
         <w:br/>

</xml_diff>

<commit_message>
fixed fiddler crab photo again
</commit_message>
<xml_diff>
--- a/docs/content/multivariate_statistics/multivariate_statistics_lecture.docx
+++ b/docs/content/multivariate_statistics/multivariate_statistics_lecture.docx
@@ -19283,6 +19283,150 @@
         <w:rPr>
           <w:rStyle w:val="DocumentationTok"/>
         </w:rPr>
+        <w:t xml:space="preserve">##          Df SumOfSqs      R2      F Pr(&gt;F)   </w:t>
+      </w:r>
+      <w:r>
+        <w:br/>
+      </w:r>
+      <w:r>
+        <w:rPr>
+          <w:rStyle w:val="DocumentationTok"/>
+        </w:rPr>
+        <w:t xml:space="preserve">## Model     1   32.602 0.10636 5.7128  0.003 **</w:t>
+      </w:r>
+      <w:r>
+        <w:br/>
+      </w:r>
+      <w:r>
+        <w:rPr>
+          <w:rStyle w:val="DocumentationTok"/>
+        </w:rPr>
+        <w:t xml:space="preserve">## Residual 48  273.930 0.89364                 </w:t>
+      </w:r>
+      <w:r>
+        <w:br/>
+      </w:r>
+      <w:r>
+        <w:rPr>
+          <w:rStyle w:val="DocumentationTok"/>
+        </w:rPr>
+        <w:t xml:space="preserve">## Total    49  306.532 1.00000                 </w:t>
+      </w:r>
+      <w:r>
+        <w:br/>
+      </w:r>
+      <w:r>
+        <w:rPr>
+          <w:rStyle w:val="DocumentationTok"/>
+        </w:rPr>
+        <w:t xml:space="preserve">## ---</w:t>
+      </w:r>
+      <w:r>
+        <w:br/>
+      </w:r>
+      <w:r>
+        <w:rPr>
+          <w:rStyle w:val="DocumentationTok"/>
+        </w:rPr>
+        <w:t xml:space="preserve">## Signif. codes:  0 '***' 0.001 '**' 0.01 '*' 0.05 '.' 0.1 ' ' 1</w:t>
+      </w:r>
+      <w:r>
+        <w:br/>
+      </w:r>
+      <w:r>
+        <w:rPr>
+          <w:rStyle w:val="DocumentationTok"/>
+        </w:rPr>
+        <w:t xml:space="preserve">## </w:t>
+      </w:r>
+      <w:r>
+        <w:br/>
+      </w:r>
+      <w:r>
+        <w:rPr>
+          <w:rStyle w:val="DocumentationTok"/>
+        </w:rPr>
+        <w:t xml:space="preserve">## $TJH_vs_LEH</w:t>
+      </w:r>
+      <w:r>
+        <w:br/>
+      </w:r>
+      <w:r>
+        <w:rPr>
+          <w:rStyle w:val="DocumentationTok"/>
+        </w:rPr>
+        <w:t xml:space="preserve">##          Df SumOfSqs      R2      F Pr(&gt;F)   </w:t>
+      </w:r>
+      <w:r>
+        <w:br/>
+      </w:r>
+      <w:r>
+        <w:rPr>
+          <w:rStyle w:val="DocumentationTok"/>
+        </w:rPr>
+        <w:t xml:space="preserve">## Model     1    47.72 0.10517 5.6414  0.004 **</w:t>
+      </w:r>
+      <w:r>
+        <w:br/>
+      </w:r>
+      <w:r>
+        <w:rPr>
+          <w:rStyle w:val="DocumentationTok"/>
+        </w:rPr>
+        <w:t xml:space="preserve">## Residual 48   406.06 0.89483                 </w:t>
+      </w:r>
+      <w:r>
+        <w:br/>
+      </w:r>
+      <w:r>
+        <w:rPr>
+          <w:rStyle w:val="DocumentationTok"/>
+        </w:rPr>
+        <w:t xml:space="preserve">## Total    49   453.78 1.00000                 </w:t>
+      </w:r>
+      <w:r>
+        <w:br/>
+      </w:r>
+      <w:r>
+        <w:rPr>
+          <w:rStyle w:val="DocumentationTok"/>
+        </w:rPr>
+        <w:t xml:space="preserve">## ---</w:t>
+      </w:r>
+      <w:r>
+        <w:br/>
+      </w:r>
+      <w:r>
+        <w:rPr>
+          <w:rStyle w:val="DocumentationTok"/>
+        </w:rPr>
+        <w:t xml:space="preserve">## Signif. codes:  0 '***' 0.001 '**' 0.01 '*' 0.05 '.' 0.1 ' ' 1</w:t>
+      </w:r>
+      <w:r>
+        <w:br/>
+      </w:r>
+      <w:r>
+        <w:rPr>
+          <w:rStyle w:val="DocumentationTok"/>
+        </w:rPr>
+        <w:t xml:space="preserve">## </w:t>
+      </w:r>
+      <w:r>
+        <w:br/>
+      </w:r>
+      <w:r>
+        <w:rPr>
+          <w:rStyle w:val="DocumentationTok"/>
+        </w:rPr>
+        <w:t xml:space="preserve">## $TJH_vs_HD</w:t>
+      </w:r>
+      <w:r>
+        <w:br/>
+      </w:r>
+      <w:r>
+        <w:rPr>
+          <w:rStyle w:val="DocumentationTok"/>
+        </w:rPr>
         <w:t xml:space="preserve">##          Df SumOfSqs      R2      F Pr(&gt;F)    </w:t>
       </w:r>
       <w:r>
@@ -19292,7 +19436,7 @@
         <w:rPr>
           <w:rStyle w:val="DocumentationTok"/>
         </w:rPr>
-        <w:t xml:space="preserve">## Model     1   32.602 0.10636 5.7128  0.001 ***</w:t>
+        <w:t xml:space="preserve">## Model     1   69.308 0.25135 11.751  0.001 ***</w:t>
       </w:r>
       <w:r>
         <w:br/>
@@ -19301,7 +19445,7 @@
         <w:rPr>
           <w:rStyle w:val="DocumentationTok"/>
         </w:rPr>
-        <w:t xml:space="preserve">## Residual 48  273.930 0.89364                  </w:t>
+        <w:t xml:space="preserve">## Residual 35  206.432 0.74865                  </w:t>
       </w:r>
       <w:r>
         <w:br/>
@@ -19310,7 +19454,7 @@
         <w:rPr>
           <w:rStyle w:val="DocumentationTok"/>
         </w:rPr>
-        <w:t xml:space="preserve">## Total    49  306.532 1.00000                  </w:t>
+        <w:t xml:space="preserve">## Total    36  275.740 1.00000                  </w:t>
       </w:r>
       <w:r>
         <w:br/>
@@ -19346,7 +19490,7 @@
         <w:rPr>
           <w:rStyle w:val="DocumentationTok"/>
         </w:rPr>
-        <w:t xml:space="preserve">## $TJH_vs_LEH</w:t>
+        <w:t xml:space="preserve">## $DG_vs_LEH</w:t>
       </w:r>
       <w:r>
         <w:br/>
@@ -19355,7 +19499,7 @@
         <w:rPr>
           <w:rStyle w:val="DocumentationTok"/>
         </w:rPr>
-        <w:t xml:space="preserve">##          Df SumOfSqs      R2      F Pr(&gt;F)   </w:t>
+        <w:t xml:space="preserve">##          Df SumOfSqs      R2      F Pr(&gt;F)  </w:t>
       </w:r>
       <w:r>
         <w:br/>
@@ -19364,151 +19508,7 @@
         <w:rPr>
           <w:rStyle w:val="DocumentationTok"/>
         </w:rPr>
-        <w:t xml:space="preserve">## Model     1    47.72 0.10517 5.6414  0.005 **</w:t>
-      </w:r>
-      <w:r>
-        <w:br/>
-      </w:r>
-      <w:r>
-        <w:rPr>
-          <w:rStyle w:val="DocumentationTok"/>
-        </w:rPr>
-        <w:t xml:space="preserve">## Residual 48   406.06 0.89483                 </w:t>
-      </w:r>
-      <w:r>
-        <w:br/>
-      </w:r>
-      <w:r>
-        <w:rPr>
-          <w:rStyle w:val="DocumentationTok"/>
-        </w:rPr>
-        <w:t xml:space="preserve">## Total    49   453.78 1.00000                 </w:t>
-      </w:r>
-      <w:r>
-        <w:br/>
-      </w:r>
-      <w:r>
-        <w:rPr>
-          <w:rStyle w:val="DocumentationTok"/>
-        </w:rPr>
-        <w:t xml:space="preserve">## ---</w:t>
-      </w:r>
-      <w:r>
-        <w:br/>
-      </w:r>
-      <w:r>
-        <w:rPr>
-          <w:rStyle w:val="DocumentationTok"/>
-        </w:rPr>
-        <w:t xml:space="preserve">## Signif. codes:  0 '***' 0.001 '**' 0.01 '*' 0.05 '.' 0.1 ' ' 1</w:t>
-      </w:r>
-      <w:r>
-        <w:br/>
-      </w:r>
-      <w:r>
-        <w:rPr>
-          <w:rStyle w:val="DocumentationTok"/>
-        </w:rPr>
-        <w:t xml:space="preserve">## </w:t>
-      </w:r>
-      <w:r>
-        <w:br/>
-      </w:r>
-      <w:r>
-        <w:rPr>
-          <w:rStyle w:val="DocumentationTok"/>
-        </w:rPr>
-        <w:t xml:space="preserve">## $TJH_vs_HD</w:t>
-      </w:r>
-      <w:r>
-        <w:br/>
-      </w:r>
-      <w:r>
-        <w:rPr>
-          <w:rStyle w:val="DocumentationTok"/>
-        </w:rPr>
-        <w:t xml:space="preserve">##          Df SumOfSqs      R2      F Pr(&gt;F)    </w:t>
-      </w:r>
-      <w:r>
-        <w:br/>
-      </w:r>
-      <w:r>
-        <w:rPr>
-          <w:rStyle w:val="DocumentationTok"/>
-        </w:rPr>
-        <w:t xml:space="preserve">## Model     1   69.308 0.25135 11.751  0.001 ***</w:t>
-      </w:r>
-      <w:r>
-        <w:br/>
-      </w:r>
-      <w:r>
-        <w:rPr>
-          <w:rStyle w:val="DocumentationTok"/>
-        </w:rPr>
-        <w:t xml:space="preserve">## Residual 35  206.432 0.74865                  </w:t>
-      </w:r>
-      <w:r>
-        <w:br/>
-      </w:r>
-      <w:r>
-        <w:rPr>
-          <w:rStyle w:val="DocumentationTok"/>
-        </w:rPr>
-        <w:t xml:space="preserve">## Total    36  275.740 1.00000                  </w:t>
-      </w:r>
-      <w:r>
-        <w:br/>
-      </w:r>
-      <w:r>
-        <w:rPr>
-          <w:rStyle w:val="DocumentationTok"/>
-        </w:rPr>
-        <w:t xml:space="preserve">## ---</w:t>
-      </w:r>
-      <w:r>
-        <w:br/>
-      </w:r>
-      <w:r>
-        <w:rPr>
-          <w:rStyle w:val="DocumentationTok"/>
-        </w:rPr>
-        <w:t xml:space="preserve">## Signif. codes:  0 '***' 0.001 '**' 0.01 '*' 0.05 '.' 0.1 ' ' 1</w:t>
-      </w:r>
-      <w:r>
-        <w:br/>
-      </w:r>
-      <w:r>
-        <w:rPr>
-          <w:rStyle w:val="DocumentationTok"/>
-        </w:rPr>
-        <w:t xml:space="preserve">## </w:t>
-      </w:r>
-      <w:r>
-        <w:br/>
-      </w:r>
-      <w:r>
-        <w:rPr>
-          <w:rStyle w:val="DocumentationTok"/>
-        </w:rPr>
-        <w:t xml:space="preserve">## $DG_vs_LEH</w:t>
-      </w:r>
-      <w:r>
-        <w:br/>
-      </w:r>
-      <w:r>
-        <w:rPr>
-          <w:rStyle w:val="DocumentationTok"/>
-        </w:rPr>
-        <w:t xml:space="preserve">##          Df SumOfSqs      R2      F Pr(&gt;F)  </w:t>
-      </w:r>
-      <w:r>
-        <w:br/>
-      </w:r>
-      <w:r>
-        <w:rPr>
-          <w:rStyle w:val="DocumentationTok"/>
-        </w:rPr>
-        <w:t xml:space="preserve">## Model     1    26.24 0.06493 3.3333  0.015 *</w:t>
+        <w:t xml:space="preserve">## Model     1    26.24 0.06493 3.3333  0.021 *</w:t>
       </w:r>
       <w:r>
         <w:br/>
@@ -20015,7 +20015,7 @@
         <w:rPr>
           <w:rStyle w:val="DocumentationTok"/>
         </w:rPr>
-        <w:t xml:space="preserve">## LEH 0.102 0.006 -    </w:t>
+        <w:t xml:space="preserve">## LEH 0.108 0.006 -    </w:t>
       </w:r>
       <w:r>
         <w:br/>
@@ -20024,7 +20024,7 @@
         <w:rPr>
           <w:rStyle w:val="DocumentationTok"/>
         </w:rPr>
-        <w:t xml:space="preserve">## TJH 0.012 0.006 0.006</w:t>
+        <w:t xml:space="preserve">## TJH 0.024 0.006 0.006</w:t>
       </w:r>
       <w:r>
         <w:br/>

</xml_diff>